<commit_message>
update the figure download issue and some input data
</commit_message>
<xml_diff>
--- a/Backend/src/templates/Form 2.docx
+++ b/Backend/src/templates/Form 2.docx
@@ -269,6 +269,14 @@
           <w:szCs w:val="24"/>
         </w:rPr>
       </w:pPr>
+      <w:r>
+        <w:rPr>
+          <w:rFonts w:ascii="Cambria" w:hAnsi="Cambria"/>
+          <w:sz w:val="24"/>
+          <w:szCs w:val="24"/>
+        </w:rPr>
+        <w:t>APPLICANT</w:t>
+      </w:r>
     </w:p>
     <w:p>
       <w:pPr>
@@ -288,7 +296,23 @@
           <w:sz w:val="24"/>
           <w:szCs w:val="24"/>
         </w:rPr>
+        <w:t>{</w:t>
+      </w:r>
+      <w:r>
+        <w:rPr>
+          <w:rFonts w:ascii="Cambria" w:hAnsi="Cambria"/>
+          <w:sz w:val="24"/>
+          <w:szCs w:val="24"/>
+        </w:rPr>
         <w:t>APPLICANT</w:t>
+      </w:r>
+      <w:r>
+        <w:rPr>
+          <w:rFonts w:ascii="Cambria" w:hAnsi="Cambria"/>
+          <w:sz w:val="24"/>
+          <w:szCs w:val="24"/>
+        </w:rPr>
+        <w:t>_NAME}</w:t>
       </w:r>
     </w:p>
     <w:p>
@@ -358,6 +382,48 @@
     </w:p>
     <w:p>
       <w:pPr>
+        <w:autoSpaceDE w:val="0"/>
+        <w:autoSpaceDN w:val="0"/>
+        <w:adjustRightInd w:val="0"/>
+        <w:spacing w:line="480" w:lineRule="auto"/>
+        <w:jc w:val="both"/>
+        <w:rPr>
+          <w:rFonts w:ascii="Cambria" w:hAnsi="Cambria" w:cs="Times New Roman"/>
+          <w:sz w:val="24"/>
+          <w:szCs w:val="24"/>
+        </w:rPr>
+      </w:pPr>
+    </w:p>
+    <w:p>
+      <w:pPr>
+        <w:autoSpaceDE w:val="0"/>
+        <w:autoSpaceDN w:val="0"/>
+        <w:adjustRightInd w:val="0"/>
+        <w:spacing w:line="480" w:lineRule="auto"/>
+        <w:jc w:val="both"/>
+        <w:rPr>
+          <w:rFonts w:ascii="Cambria" w:hAnsi="Cambria" w:cs="Times New Roman"/>
+          <w:sz w:val="24"/>
+          <w:szCs w:val="24"/>
+        </w:rPr>
+      </w:pPr>
+    </w:p>
+    <w:p>
+      <w:pPr>
+        <w:autoSpaceDE w:val="0"/>
+        <w:autoSpaceDN w:val="0"/>
+        <w:adjustRightInd w:val="0"/>
+        <w:spacing w:line="480" w:lineRule="auto"/>
+        <w:jc w:val="both"/>
+        <w:rPr>
+          <w:rFonts w:ascii="Cambria" w:hAnsi="Cambria" w:cs="Times New Roman"/>
+          <w:sz w:val="24"/>
+          <w:szCs w:val="24"/>
+        </w:rPr>
+      </w:pPr>
+    </w:p>
+    <w:p>
+      <w:pPr>
         <w:pStyle w:val="MediumGrid1-Accent21"/>
         <w:spacing w:beforeAutospacing="0" w:after="0" w:line="480" w:lineRule="auto"/>
         <w:ind w:left="0" w:right="45"/>
@@ -378,6 +444,7 @@
           <w:sz w:val="24"/>
           <w:szCs w:val="24"/>
         </w:rPr>
+        <w:lastRenderedPageBreak/>
         <w:t>{TITLE}</w:t>
       </w:r>
     </w:p>
@@ -419,346 +486,262 @@
           <w:sz w:val="24"/>
           <w:szCs w:val="24"/>
         </w:rPr>
-        <w:tab/>
-      </w:r>
-      <w:r>
+        <w:t>{technical_field}</w:t>
+      </w:r>
+    </w:p>
+    <w:p>
+      <w:pPr>
+        <w:spacing w:line="480" w:lineRule="auto"/>
+        <w:jc w:val="both"/>
         <w:rPr>
           <w:rFonts w:ascii="Cambria" w:hAnsi="Cambria"/>
           <w:color w:val="FF0000"/>
           <w:sz w:val="24"/>
           <w:szCs w:val="24"/>
         </w:rPr>
+      </w:pPr>
+    </w:p>
+    <w:p>
+      <w:pPr>
+        <w:spacing w:line="480" w:lineRule="auto"/>
+        <w:jc w:val="both"/>
+        <w:rPr>
+          <w:rFonts w:ascii="Cambria" w:hAnsi="Cambria"/>
+          <w:b/>
+          <w:sz w:val="24"/>
+          <w:szCs w:val="24"/>
+        </w:rPr>
+      </w:pPr>
+      <w:r>
+        <w:rPr>
+          <w:rFonts w:ascii="Cambria" w:hAnsi="Cambria"/>
+          <w:b/>
+          <w:sz w:val="24"/>
+          <w:szCs w:val="24"/>
+        </w:rPr>
+        <w:t>BACKGROUND</w:t>
+      </w:r>
+    </w:p>
+    <w:p>
+      <w:pPr>
+        <w:spacing w:line="480" w:lineRule="auto"/>
+        <w:jc w:val="both"/>
+        <w:rPr>
+          <w:rFonts w:ascii="Cambria" w:hAnsi="Cambria"/>
+          <w:color w:val="FF0000"/>
+          <w:sz w:val="24"/>
+          <w:szCs w:val="24"/>
+        </w:rPr>
+      </w:pPr>
+      <w:r>
+        <w:rPr>
+          <w:rFonts w:ascii="Cambria" w:hAnsi="Cambria"/>
+          <w:color w:val="000000" w:themeColor="text1"/>
+          <w:sz w:val="24"/>
+          <w:szCs w:val="24"/>
+        </w:rPr>
+        <w:t>{background}</w:t>
+      </w:r>
+      <w:r>
+        <w:rPr>
+          <w:rFonts w:ascii="Cambria" w:hAnsi="Cambria"/>
+          <w:color w:val="000000" w:themeColor="text1"/>
+          <w:sz w:val="24"/>
+          <w:szCs w:val="24"/>
+        </w:rPr>
         <w:t xml:space="preserve"> </w:t>
       </w:r>
     </w:p>
     <w:p>
       <w:pPr>
-        <w:pStyle w:val="MediumGrid1-Accent21"/>
-        <w:spacing w:beforeAutospacing="0" w:after="0" w:line="480" w:lineRule="auto"/>
-        <w:ind w:left="0" w:right="45"/>
-        <w:jc w:val="center"/>
-        <w:rPr>
-          <w:rFonts w:ascii="Cambria" w:hAnsi="Cambria"/>
-          <w:sz w:val="24"/>
-          <w:szCs w:val="24"/>
-        </w:rPr>
-      </w:pPr>
-      <w:r>
-        <w:rPr>
-          <w:rFonts w:ascii="Cambria" w:hAnsi="Cambria"/>
-          <w:sz w:val="24"/>
-          <w:szCs w:val="24"/>
-        </w:rPr>
-        <w:lastRenderedPageBreak/>
-        <w:t>{technical_field}</w:t>
-      </w:r>
-    </w:p>
-    <w:p>
-      <w:pPr>
-        <w:spacing w:line="480" w:lineRule="auto"/>
-        <w:jc w:val="both"/>
-        <w:rPr>
-          <w:rFonts w:ascii="Cambria" w:hAnsi="Cambria"/>
-          <w:b/>
-          <w:sz w:val="24"/>
-          <w:szCs w:val="24"/>
-        </w:rPr>
-      </w:pPr>
-    </w:p>
-    <w:p>
-      <w:pPr>
-        <w:spacing w:line="480" w:lineRule="auto"/>
-        <w:jc w:val="both"/>
-        <w:rPr>
-          <w:rFonts w:ascii="Cambria" w:hAnsi="Cambria"/>
-          <w:b/>
-          <w:sz w:val="24"/>
-          <w:szCs w:val="24"/>
-        </w:rPr>
-      </w:pPr>
-      <w:r>
-        <w:rPr>
-          <w:rFonts w:ascii="Cambria" w:hAnsi="Cambria"/>
-          <w:b/>
-          <w:sz w:val="24"/>
-          <w:szCs w:val="24"/>
-        </w:rPr>
-        <w:t>BACKGROUND</w:t>
-      </w:r>
-    </w:p>
-    <w:p>
-      <w:pPr>
-        <w:spacing w:line="480" w:lineRule="auto"/>
+        <w:spacing w:line="480" w:lineRule="auto"/>
+        <w:jc w:val="both"/>
+        <w:rPr>
+          <w:rFonts w:ascii="Cambria" w:hAnsi="Cambria"/>
+          <w:b/>
+          <w:sz w:val="24"/>
+          <w:szCs w:val="24"/>
+        </w:rPr>
+      </w:pPr>
+      <w:r>
+        <w:rPr>
+          <w:rFonts w:ascii="Cambria" w:hAnsi="Cambria"/>
+          <w:b/>
+          <w:sz w:val="24"/>
+          <w:szCs w:val="24"/>
+        </w:rPr>
+        <w:t>OBJETIVE OF THE INVENTION</w:t>
+      </w:r>
+    </w:p>
+    <w:p>
+      <w:pPr>
+        <w:spacing w:line="480" w:lineRule="auto"/>
+        <w:jc w:val="both"/>
+        <w:rPr>
+          <w:rFonts w:ascii="Cambria" w:hAnsi="Cambria"/>
+          <w:color w:val="000000" w:themeColor="text1"/>
+          <w:sz w:val="24"/>
+        </w:rPr>
+      </w:pPr>
+      <w:r>
+        <w:rPr>
+          <w:rFonts w:ascii="Cambria" w:hAnsi="Cambria"/>
+          <w:color w:val="000000" w:themeColor="text1"/>
+          <w:sz w:val="24"/>
+          <w:szCs w:val="24"/>
+        </w:rPr>
+        <w:t>{objective}</w:t>
+      </w:r>
+    </w:p>
+    <w:p>
+      <w:pPr>
+        <w:spacing w:line="480" w:lineRule="auto"/>
+        <w:jc w:val="both"/>
+        <w:rPr>
+          <w:rFonts w:ascii="Cambria" w:hAnsi="Cambria"/>
+          <w:b/>
+          <w:sz w:val="24"/>
+          <w:szCs w:val="24"/>
+        </w:rPr>
+      </w:pPr>
+      <w:r>
+        <w:rPr>
+          <w:rFonts w:ascii="Cambria" w:hAnsi="Cambria"/>
+          <w:b/>
+          <w:sz w:val="24"/>
+          <w:szCs w:val="24"/>
+        </w:rPr>
+        <w:t>SUMMARY</w:t>
+      </w:r>
+    </w:p>
+    <w:p>
+      <w:pPr>
+        <w:spacing w:line="480" w:lineRule="auto"/>
+        <w:jc w:val="both"/>
+        <w:rPr>
+          <w:rFonts w:ascii="Cambria" w:hAnsi="Cambria"/>
+          <w:color w:val="000000" w:themeColor="text1"/>
+          <w:sz w:val="24"/>
+        </w:rPr>
+      </w:pPr>
+      <w:r>
+        <w:rPr>
+          <w:rFonts w:ascii="Cambria" w:hAnsi="Cambria"/>
+          <w:color w:val="000000" w:themeColor="text1"/>
+          <w:sz w:val="24"/>
+          <w:szCs w:val="24"/>
+        </w:rPr>
+        <w:t>{summary}</w:t>
+      </w:r>
+    </w:p>
+    <w:p>
+      <w:pPr>
+        <w:spacing w:after="259" w:line="480" w:lineRule="auto"/>
         <w:jc w:val="both"/>
         <w:rPr>
           <w:rFonts w:ascii="Cambria" w:hAnsi="Cambria"/>
           <w:color w:val="FF0000"/>
           <w:sz w:val="24"/>
-          <w:szCs w:val="24"/>
-        </w:rPr>
-      </w:pPr>
-      <w:r>
-        <w:rPr>
-          <w:rFonts w:ascii="Cambria" w:hAnsi="Cambria"/>
+        </w:rPr>
+      </w:pPr>
+    </w:p>
+    <w:p>
+      <w:pPr>
+        <w:spacing w:line="480" w:lineRule="auto"/>
+        <w:jc w:val="both"/>
+        <w:rPr>
+          <w:rFonts w:ascii="Cambria" w:hAnsi="Cambria"/>
+          <w:b/>
+          <w:sz w:val="24"/>
+          <w:szCs w:val="24"/>
+        </w:rPr>
+      </w:pPr>
+      <w:r>
+        <w:rPr>
+          <w:rFonts w:ascii="Cambria" w:hAnsi="Cambria"/>
+          <w:b/>
+          <w:sz w:val="24"/>
+          <w:szCs w:val="24"/>
+        </w:rPr>
+        <w:t>BRIEF DESCRIPTION OF THE DRAWINGS</w:t>
+      </w:r>
+    </w:p>
+    <w:p>
+      <w:pPr>
+        <w:pStyle w:val="NoSpacing"/>
+        <w:spacing w:line="480" w:lineRule="auto"/>
+        <w:jc w:val="both"/>
+        <w:rPr>
           <w:color w:val="000000" w:themeColor="text1"/>
           <w:sz w:val="24"/>
           <w:szCs w:val="24"/>
         </w:rPr>
+      </w:pPr>
+      <w:r>
+        <w:rPr>
+          <w:color w:val="000000" w:themeColor="text1"/>
+          <w:sz w:val="24"/>
+          <w:szCs w:val="24"/>
+        </w:rPr>
         <w:t>{</w:t>
       </w:r>
       <w:r>
         <w:rPr>
-          <w:rFonts w:ascii="Cambria" w:hAnsi="Cambria"/>
           <w:color w:val="000000" w:themeColor="text1"/>
           <w:sz w:val="24"/>
           <w:szCs w:val="24"/>
-        </w:rPr>
-        <w:t>background</w:t>
-      </w:r>
-      <w:r>
-        <w:rPr>
-          <w:rFonts w:ascii="Cambria" w:hAnsi="Cambria"/>
+          <w:lang w:val="en-IN"/>
+        </w:rPr>
+        <w:t>brief_description</w:t>
+      </w:r>
+      <w:r>
+        <w:rPr>
           <w:color w:val="000000" w:themeColor="text1"/>
           <w:sz w:val="24"/>
           <w:szCs w:val="24"/>
         </w:rPr>
         <w:t>}</w:t>
       </w:r>
-      <w:r>
-        <w:rPr>
-          <w:rFonts w:ascii="Cambria" w:hAnsi="Cambria"/>
+    </w:p>
+    <w:p>
+      <w:pPr>
+        <w:spacing w:line="480" w:lineRule="auto"/>
+        <w:jc w:val="both"/>
+        <w:rPr>
+          <w:rFonts w:ascii="Cambria" w:hAnsi="Cambria"/>
+          <w:b/>
+          <w:sz w:val="24"/>
+          <w:szCs w:val="24"/>
+        </w:rPr>
+      </w:pPr>
+      <w:r>
+        <w:rPr>
+          <w:rFonts w:ascii="Cambria" w:hAnsi="Cambria"/>
+          <w:b/>
+          <w:sz w:val="24"/>
+          <w:szCs w:val="24"/>
+        </w:rPr>
+        <w:t>DETAILED DESCRIPTION</w:t>
+      </w:r>
+    </w:p>
+    <w:p>
+      <w:pPr>
+        <w:spacing w:line="480" w:lineRule="auto"/>
+        <w:rPr>
+          <w:rFonts w:ascii="Cambria" w:hAnsi="Cambria"/>
+          <w:b/>
           <w:color w:val="000000" w:themeColor="text1"/>
           <w:sz w:val="24"/>
           <w:szCs w:val="24"/>
         </w:rPr>
-        <w:t xml:space="preserve"> </w:t>
-      </w:r>
-    </w:p>
-    <w:p>
-      <w:pPr>
-        <w:spacing w:line="480" w:lineRule="auto"/>
-        <w:jc w:val="both"/>
-        <w:rPr>
-          <w:rFonts w:ascii="Cambria" w:hAnsi="Cambria"/>
-          <w:b/>
-          <w:sz w:val="24"/>
-          <w:szCs w:val="24"/>
-        </w:rPr>
-      </w:pPr>
-      <w:r>
-        <w:rPr>
-          <w:rFonts w:ascii="Cambria" w:hAnsi="Cambria"/>
-          <w:b/>
-          <w:sz w:val="24"/>
-          <w:szCs w:val="24"/>
-        </w:rPr>
-        <w:t>OBJETIVE OF THE INVENTION</w:t>
-      </w:r>
-    </w:p>
-    <w:p>
-      <w:pPr>
-        <w:spacing w:line="480" w:lineRule="auto"/>
-        <w:jc w:val="both"/>
+      </w:pPr>
+      <w:r>
         <w:rPr>
           <w:rFonts w:ascii="Cambria" w:hAnsi="Cambria"/>
           <w:color w:val="000000" w:themeColor="text1"/>
           <w:sz w:val="24"/>
         </w:rPr>
-      </w:pPr>
-      <w:r>
-        <w:rPr>
-          <w:rFonts w:ascii="Cambria" w:hAnsi="Cambria"/>
-          <w:color w:val="000000" w:themeColor="text1"/>
-          <w:sz w:val="24"/>
-          <w:szCs w:val="24"/>
-        </w:rPr>
-        <w:t>{</w:t>
-      </w:r>
-      <w:r>
-        <w:rPr>
-          <w:rFonts w:ascii="Cambria" w:hAnsi="Cambria"/>
-          <w:color w:val="000000" w:themeColor="text1"/>
-          <w:sz w:val="24"/>
-          <w:szCs w:val="24"/>
-        </w:rPr>
-        <w:t>objective</w:t>
-      </w:r>
-      <w:r>
-        <w:rPr>
-          <w:rFonts w:ascii="Cambria" w:hAnsi="Cambria"/>
-          <w:color w:val="000000" w:themeColor="text1"/>
-          <w:sz w:val="24"/>
-          <w:szCs w:val="24"/>
-        </w:rPr>
-        <w:t>}</w:t>
-      </w:r>
-    </w:p>
-    <w:p>
-      <w:pPr>
-        <w:spacing w:line="480" w:lineRule="auto"/>
-        <w:jc w:val="both"/>
-        <w:rPr>
-          <w:rFonts w:ascii="Cambria" w:hAnsi="Cambria"/>
-          <w:b/>
-          <w:sz w:val="24"/>
-          <w:szCs w:val="24"/>
-        </w:rPr>
-      </w:pPr>
-      <w:r>
-        <w:rPr>
-          <w:rFonts w:ascii="Cambria" w:hAnsi="Cambria"/>
-          <w:b/>
-          <w:sz w:val="24"/>
-          <w:szCs w:val="24"/>
-        </w:rPr>
-        <w:t>SUMMARY</w:t>
-      </w:r>
-    </w:p>
-    <w:p>
-      <w:pPr>
-        <w:spacing w:line="480" w:lineRule="auto"/>
-        <w:jc w:val="both"/>
-        <w:rPr>
-          <w:rFonts w:ascii="Cambria" w:hAnsi="Cambria"/>
-          <w:color w:val="000000" w:themeColor="text1"/>
-          <w:sz w:val="24"/>
-        </w:rPr>
-      </w:pPr>
-      <w:r>
-        <w:rPr>
-          <w:rFonts w:ascii="Cambria" w:hAnsi="Cambria"/>
-          <w:color w:val="000000" w:themeColor="text1"/>
-          <w:sz w:val="24"/>
-          <w:szCs w:val="24"/>
-        </w:rPr>
-        <w:t>{summary}</w:t>
-      </w:r>
-    </w:p>
-    <w:p>
-      <w:pPr>
-        <w:spacing w:after="259" w:line="480" w:lineRule="auto"/>
-        <w:ind w:firstLine="720"/>
-        <w:jc w:val="both"/>
-        <w:rPr>
-          <w:rFonts w:ascii="Cambria" w:hAnsi="Cambria"/>
-          <w:color w:val="FF0000"/>
-          <w:sz w:val="24"/>
-        </w:rPr>
-      </w:pPr>
-      <w:r>
-        <w:rPr>
-          <w:rFonts w:ascii="Cambria" w:hAnsi="Cambria"/>
-          <w:color w:val="FF0000"/>
-          <w:sz w:val="24"/>
-        </w:rPr>
-        <w:t>.</w:t>
-      </w:r>
-    </w:p>
-    <w:p>
-      <w:pPr>
-        <w:spacing w:line="480" w:lineRule="auto"/>
-        <w:jc w:val="both"/>
-        <w:rPr>
-          <w:rFonts w:ascii="Cambria" w:hAnsi="Cambria"/>
-          <w:b/>
-          <w:sz w:val="24"/>
-          <w:szCs w:val="24"/>
-        </w:rPr>
-      </w:pPr>
-      <w:r>
-        <w:rPr>
-          <w:rFonts w:ascii="Cambria" w:hAnsi="Cambria"/>
-          <w:b/>
-          <w:sz w:val="24"/>
-          <w:szCs w:val="24"/>
-        </w:rPr>
-        <w:t>BRIEF DESCRIPTION OF THE DRAWINGS</w:t>
-      </w:r>
-    </w:p>
-    <w:p>
-      <w:pPr>
-        <w:pStyle w:val="NoSpacing"/>
-        <w:spacing w:line="480" w:lineRule="auto"/>
-        <w:jc w:val="both"/>
-        <w:rPr>
-          <w:color w:val="000000" w:themeColor="text1"/>
-          <w:sz w:val="24"/>
-          <w:szCs w:val="24"/>
-        </w:rPr>
-      </w:pPr>
-      <w:r>
-        <w:rPr>
-          <w:color w:val="000000" w:themeColor="text1"/>
-          <w:sz w:val="24"/>
-          <w:szCs w:val="24"/>
-        </w:rPr>
-        <w:t>{</w:t>
-      </w:r>
-      <w:r>
-        <w:rPr>
-          <w:color w:val="000000" w:themeColor="text1"/>
-          <w:sz w:val="24"/>
-          <w:szCs w:val="24"/>
-          <w:lang w:val="en-IN"/>
-        </w:rPr>
-        <w:t>brief_description</w:t>
-      </w:r>
-      <w:r>
-        <w:rPr>
-          <w:color w:val="000000" w:themeColor="text1"/>
-          <w:sz w:val="24"/>
-          <w:szCs w:val="24"/>
-        </w:rPr>
-        <w:t>}</w:t>
-      </w:r>
-    </w:p>
-    <w:p>
-      <w:pPr>
-        <w:spacing w:line="480" w:lineRule="auto"/>
-        <w:jc w:val="both"/>
-        <w:rPr>
-          <w:rFonts w:ascii="Cambria" w:hAnsi="Cambria"/>
-          <w:b/>
-          <w:sz w:val="24"/>
-          <w:szCs w:val="24"/>
-        </w:rPr>
-      </w:pPr>
-      <w:r>
-        <w:rPr>
-          <w:rFonts w:ascii="Cambria" w:hAnsi="Cambria"/>
-          <w:b/>
-          <w:sz w:val="24"/>
-          <w:szCs w:val="24"/>
-        </w:rPr>
-        <w:t>DETAILED DESCRIPTION</w:t>
-      </w:r>
-    </w:p>
-    <w:p>
-      <w:pPr>
-        <w:spacing w:line="480" w:lineRule="auto"/>
-        <w:rPr>
-          <w:rFonts w:ascii="Cambria" w:hAnsi="Cambria"/>
-          <w:b/>
-          <w:color w:val="000000" w:themeColor="text1"/>
-          <w:sz w:val="24"/>
-          <w:szCs w:val="24"/>
-        </w:rPr>
-      </w:pPr>
-      <w:r>
-        <w:rPr>
-          <w:rFonts w:ascii="Cambria" w:hAnsi="Cambria"/>
-          <w:color w:val="000000" w:themeColor="text1"/>
-          <w:sz w:val="24"/>
-        </w:rPr>
-        <w:t>{</w:t>
-      </w:r>
-      <w:r>
-        <w:rPr>
-          <w:rFonts w:ascii="Cambria" w:hAnsi="Cambria"/>
-          <w:color w:val="000000" w:themeColor="text1"/>
-          <w:sz w:val="24"/>
-        </w:rPr>
-        <w:t>detailed_description</w:t>
+        <w:t>{detailed_description</w:t>
       </w:r>
       <w:r>
         <w:rPr>
@@ -779,16 +762,290 @@
         <w:ind w:left="5849" w:right="109" w:hanging="2789"/>
         <w:jc w:val="both"/>
         <w:rPr>
-          <w:sz w:val="24"/>
-        </w:rPr>
-      </w:pPr>
-      <w:r>
-        <w:rPr>
           <w:noProof/>
           <w:sz w:val="24"/>
           <w:lang w:eastAsia="en-IN"/>
         </w:rPr>
+      </w:pPr>
+      <w:r>
+        <w:rPr>
+          <w:noProof/>
+          <w:sz w:val="24"/>
+          <w:lang w:eastAsia="en-IN"/>
+        </w:rPr>
         <w:t xml:space="preserve">                                                    </w:t>
+      </w:r>
+    </w:p>
+    <w:p>
+      <w:pPr>
+        <w:pStyle w:val="TableParagraph"/>
+        <w:tabs>
+          <w:tab w:val="left" w:pos="6345"/>
+        </w:tabs>
+        <w:spacing w:before="230" w:line="247" w:lineRule="auto"/>
+        <w:ind w:left="5849" w:right="109" w:hanging="2789"/>
+        <w:jc w:val="both"/>
+        <w:rPr>
+          <w:noProof/>
+          <w:sz w:val="24"/>
+          <w:lang w:eastAsia="en-IN"/>
+        </w:rPr>
+      </w:pPr>
+    </w:p>
+    <w:p>
+      <w:pPr>
+        <w:pStyle w:val="TableParagraph"/>
+        <w:tabs>
+          <w:tab w:val="left" w:pos="6345"/>
+        </w:tabs>
+        <w:spacing w:before="230" w:line="247" w:lineRule="auto"/>
+        <w:ind w:left="5849" w:right="109" w:hanging="2789"/>
+        <w:jc w:val="both"/>
+        <w:rPr>
+          <w:color w:val="000000" w:themeColor="text1"/>
+          <w:sz w:val="24"/>
+          <w:lang w:val="en-IN"/>
+        </w:rPr>
+      </w:pPr>
+    </w:p>
+    <w:p>
+      <w:pPr>
+        <w:spacing w:line="480" w:lineRule="auto"/>
+        <w:jc w:val="both"/>
+        <w:rPr>
+          <w:rFonts w:ascii="Cambria" w:hAnsi="Cambria"/>
+          <w:sz w:val="24"/>
+          <w:szCs w:val="24"/>
+        </w:rPr>
+      </w:pPr>
+    </w:p>
+    <w:p>
+      <w:pPr>
+        <w:spacing w:line="480" w:lineRule="auto"/>
+        <w:jc w:val="center"/>
+        <w:rPr>
+          <w:rFonts w:ascii="Cambria" w:hAnsi="Cambria"/>
+          <w:b/>
+          <w:sz w:val="24"/>
+          <w:szCs w:val="24"/>
+        </w:rPr>
+      </w:pPr>
+      <w:r>
+        <w:rPr>
+          <w:rFonts w:ascii="Cambria" w:hAnsi="Cambria"/>
+          <w:b/>
+          <w:sz w:val="24"/>
+          <w:szCs w:val="24"/>
+        </w:rPr>
+        <w:lastRenderedPageBreak/>
+        <w:t>CLAIMS</w:t>
+      </w:r>
+    </w:p>
+    <w:p>
+      <w:pPr>
+        <w:spacing w:line="480" w:lineRule="auto"/>
+        <w:rPr>
+          <w:rFonts w:ascii="Cambria" w:hAnsi="Cambria"/>
+          <w:b/>
+          <w:sz w:val="24"/>
+          <w:szCs w:val="24"/>
+        </w:rPr>
+      </w:pPr>
+      <w:r>
+        <w:rPr>
+          <w:rFonts w:ascii="Cambria" w:hAnsi="Cambria"/>
+          <w:b/>
+          <w:sz w:val="24"/>
+          <w:szCs w:val="24"/>
+        </w:rPr>
+        <w:t>We claim,</w:t>
+      </w:r>
+    </w:p>
+    <w:p>
+      <w:pPr>
+        <w:spacing w:line="480" w:lineRule="auto"/>
+        <w:jc w:val="both"/>
+        <w:rPr>
+          <w:rFonts w:ascii="Cambria" w:hAnsi="Cambria"/>
+          <w:color w:val="000000" w:themeColor="text1"/>
+          <w:sz w:val="24"/>
+          <w:szCs w:val="24"/>
+        </w:rPr>
+      </w:pPr>
+      <w:r>
+        <w:rPr>
+          <w:rFonts w:ascii="Cambria" w:hAnsi="Cambria"/>
+          <w:color w:val="000000" w:themeColor="text1"/>
+          <w:sz w:val="24"/>
+          <w:szCs w:val="24"/>
+        </w:rPr>
+        <w:t>{</w:t>
+      </w:r>
+      <w:r>
+        <w:rPr>
+          <w:rFonts w:ascii="Cambria" w:hAnsi="Cambria"/>
+          <w:color w:val="000000" w:themeColor="text1"/>
+          <w:sz w:val="24"/>
+          <w:szCs w:val="24"/>
+        </w:rPr>
+        <w:t>claim</w:t>
+      </w:r>
+      <w:r>
+        <w:rPr>
+          <w:rFonts w:ascii="Cambria" w:hAnsi="Cambria"/>
+          <w:color w:val="000000" w:themeColor="text1"/>
+          <w:sz w:val="24"/>
+          <w:szCs w:val="24"/>
+        </w:rPr>
+        <w:t>s</w:t>
+      </w:r>
+      <w:r>
+        <w:rPr>
+          <w:rFonts w:ascii="Cambria" w:hAnsi="Cambria"/>
+          <w:color w:val="000000" w:themeColor="text1"/>
+          <w:sz w:val="24"/>
+          <w:szCs w:val="24"/>
+        </w:rPr>
+        <w:t>}</w:t>
+      </w:r>
+      <w:r>
+        <w:rPr>
+          <w:rFonts w:ascii="Cambria" w:hAnsi="Cambria"/>
+          <w:color w:val="000000" w:themeColor="text1"/>
+          <w:sz w:val="24"/>
+          <w:szCs w:val="24"/>
+        </w:rPr>
+        <w:t xml:space="preserve"> </w:t>
+      </w:r>
+    </w:p>
+    <w:p>
+      <w:pPr>
+        <w:spacing w:line="480" w:lineRule="auto"/>
+        <w:jc w:val="both"/>
+        <w:rPr>
+          <w:rFonts w:ascii="Cambria" w:hAnsi="Cambria"/>
+          <w:color w:val="FF0000"/>
+          <w:sz w:val="24"/>
+          <w:szCs w:val="24"/>
+        </w:rPr>
+      </w:pPr>
+    </w:p>
+    <w:p>
+      <w:pPr>
+        <w:pStyle w:val="TableParagraph"/>
+        <w:tabs>
+          <w:tab w:val="left" w:pos="6345"/>
+        </w:tabs>
+        <w:spacing w:before="230" w:line="247" w:lineRule="auto"/>
+        <w:ind w:left="5849" w:right="109" w:hanging="2789"/>
+        <w:jc w:val="both"/>
+        <w:rPr>
+          <w:noProof/>
+          <w:sz w:val="24"/>
+          <w:lang w:eastAsia="en-IN"/>
+        </w:rPr>
+      </w:pPr>
+      <w:r>
+        <w:rPr>
+          <w:noProof/>
+          <w:sz w:val="24"/>
+          <w:lang w:eastAsia="en-IN"/>
+        </w:rPr>
+        <w:t xml:space="preserve">                                                    </w:t>
+      </w:r>
+    </w:p>
+    <w:p>
+      <w:pPr>
+        <w:pStyle w:val="TableParagraph"/>
+        <w:tabs>
+          <w:tab w:val="left" w:pos="6345"/>
+        </w:tabs>
+        <w:spacing w:before="230" w:line="247" w:lineRule="auto"/>
+        <w:ind w:left="5849" w:right="109" w:hanging="2789"/>
+        <w:jc w:val="both"/>
+        <w:rPr>
+          <w:noProof/>
+          <w:sz w:val="24"/>
+          <w:lang w:eastAsia="en-IN"/>
+        </w:rPr>
+      </w:pPr>
+      <w:r>
+        <w:rPr>
+          <w:noProof/>
+          <w:sz w:val="24"/>
+          <w:lang w:eastAsia="en-IN"/>
+        </w:rPr>
+        <w:tab/>
+      </w:r>
+      <w:r>
+        <w:rPr>
+          <w:noProof/>
+          <w:sz w:val="24"/>
+          <w:lang w:eastAsia="en-IN"/>
+        </w:rPr>
+        <w:tab/>
+      </w:r>
+      <w:r>
+        <w:rPr>
+          <w:noProof/>
+          <w:sz w:val="24"/>
+          <w:lang w:eastAsia="en-IN"/>
+        </w:rPr>
+        <w:tab/>
+      </w:r>
+    </w:p>
+    <w:p>
+      <w:pPr>
+        <w:pStyle w:val="TableParagraph"/>
+        <w:tabs>
+          <w:tab w:val="left" w:pos="6345"/>
+        </w:tabs>
+        <w:spacing w:before="230" w:line="247" w:lineRule="auto"/>
+        <w:ind w:left="5849" w:right="109" w:hanging="2789"/>
+        <w:jc w:val="both"/>
+        <w:rPr>
+          <w:noProof/>
+          <w:sz w:val="24"/>
+          <w:lang w:eastAsia="en-IN"/>
+        </w:rPr>
+      </w:pPr>
+    </w:p>
+    <w:p>
+      <w:pPr>
+        <w:pStyle w:val="TableParagraph"/>
+        <w:tabs>
+          <w:tab w:val="left" w:pos="6345"/>
+        </w:tabs>
+        <w:spacing w:before="230" w:line="247" w:lineRule="auto"/>
+        <w:ind w:left="5849" w:right="109" w:hanging="2789"/>
+        <w:jc w:val="both"/>
+        <w:rPr>
+          <w:noProof/>
+          <w:sz w:val="24"/>
+          <w:lang w:eastAsia="en-IN"/>
+        </w:rPr>
+      </w:pPr>
+    </w:p>
+    <w:p>
+      <w:pPr>
+        <w:pStyle w:val="TableParagraph"/>
+        <w:tabs>
+          <w:tab w:val="left" w:pos="6345"/>
+        </w:tabs>
+        <w:spacing w:before="230" w:line="247" w:lineRule="auto"/>
+        <w:ind w:left="5849" w:right="109" w:hanging="2789"/>
+        <w:jc w:val="both"/>
+        <w:rPr>
+          <w:sz w:val="24"/>
+        </w:rPr>
+      </w:pPr>
+      <w:r>
+        <w:rPr>
+          <w:noProof/>
+          <w:sz w:val="24"/>
+          <w:lang w:eastAsia="en-IN"/>
+        </w:rPr>
+        <w:t xml:space="preserve">                                            </w:t>
       </w:r>
       <w:r>
         <w:rPr>
@@ -841,239 +1098,6 @@
         <w:rPr>
           <w:sz w:val="24"/>
         </w:rPr>
-        <w:t xml:space="preserve">                                             </w:t>
-      </w:r>
-      <w:r>
-        <w:rPr>
-          <w:sz w:val="24"/>
-        </w:rPr>
-        <w:t xml:space="preserve">                                                                    </w:t>
-      </w:r>
-      <w:r>
-        <w:rPr>
-          <w:color w:val="000000" w:themeColor="text1"/>
-          <w:sz w:val="24"/>
-        </w:rPr>
-        <w:t>{</w:t>
-      </w:r>
-      <w:r>
-        <w:rPr>
-          <w:color w:val="000000" w:themeColor="text1"/>
-          <w:sz w:val="24"/>
-          <w:lang w:val="en-IN"/>
-        </w:rPr>
-        <w:t>patent_officer}</w:t>
-      </w:r>
-    </w:p>
-    <w:p>
-      <w:pPr>
-        <w:spacing w:line="480" w:lineRule="auto"/>
-        <w:ind w:firstLine="720"/>
-        <w:jc w:val="both"/>
-        <w:rPr>
-          <w:rFonts w:ascii="Cambria" w:hAnsi="Cambria"/>
-          <w:sz w:val="24"/>
-          <w:szCs w:val="24"/>
-        </w:rPr>
-      </w:pPr>
-    </w:p>
-    <w:p>
-      <w:pPr>
-        <w:spacing w:line="480" w:lineRule="auto"/>
-        <w:jc w:val="both"/>
-        <w:rPr>
-          <w:rFonts w:ascii="Cambria" w:hAnsi="Cambria"/>
-          <w:sz w:val="24"/>
-          <w:szCs w:val="24"/>
-        </w:rPr>
-      </w:pPr>
-    </w:p>
-    <w:p>
-      <w:pPr>
-        <w:spacing w:line="480" w:lineRule="auto"/>
-        <w:ind w:firstLine="720"/>
-        <w:jc w:val="both"/>
-        <w:rPr>
-          <w:rFonts w:ascii="Cambria" w:hAnsi="Cambria"/>
-          <w:sz w:val="24"/>
-          <w:szCs w:val="24"/>
-        </w:rPr>
-      </w:pPr>
-    </w:p>
-    <w:p>
-      <w:pPr>
-        <w:spacing w:line="480" w:lineRule="auto"/>
-        <w:jc w:val="center"/>
-        <w:rPr>
-          <w:rFonts w:ascii="Cambria" w:hAnsi="Cambria"/>
-          <w:b/>
-          <w:sz w:val="24"/>
-          <w:szCs w:val="24"/>
-        </w:rPr>
-      </w:pPr>
-      <w:r>
-        <w:rPr>
-          <w:rFonts w:ascii="Cambria" w:hAnsi="Cambria"/>
-          <w:b/>
-          <w:sz w:val="24"/>
-          <w:szCs w:val="24"/>
-        </w:rPr>
-        <w:lastRenderedPageBreak/>
-        <w:t>CLAIMS</w:t>
-      </w:r>
-    </w:p>
-    <w:p>
-      <w:pPr>
-        <w:spacing w:line="480" w:lineRule="auto"/>
-        <w:rPr>
-          <w:rFonts w:ascii="Cambria" w:hAnsi="Cambria"/>
-          <w:b/>
-          <w:sz w:val="24"/>
-          <w:szCs w:val="24"/>
-        </w:rPr>
-      </w:pPr>
-      <w:r>
-        <w:rPr>
-          <w:rFonts w:ascii="Cambria" w:hAnsi="Cambria"/>
-          <w:b/>
-          <w:sz w:val="24"/>
-          <w:szCs w:val="24"/>
-        </w:rPr>
-        <w:t>We claim,</w:t>
-      </w:r>
-    </w:p>
-    <w:p>
-      <w:pPr>
-        <w:spacing w:line="480" w:lineRule="auto"/>
-        <w:jc w:val="both"/>
-        <w:rPr>
-          <w:rFonts w:ascii="Cambria" w:hAnsi="Cambria"/>
-          <w:color w:val="000000" w:themeColor="text1"/>
-          <w:sz w:val="24"/>
-          <w:szCs w:val="24"/>
-        </w:rPr>
-      </w:pPr>
-      <w:r>
-        <w:rPr>
-          <w:rFonts w:ascii="Cambria" w:hAnsi="Cambria"/>
-          <w:color w:val="000000" w:themeColor="text1"/>
-          <w:sz w:val="24"/>
-          <w:szCs w:val="24"/>
-        </w:rPr>
-        <w:t>{</w:t>
-      </w:r>
-      <w:r>
-        <w:rPr>
-          <w:rFonts w:ascii="Cambria" w:hAnsi="Cambria"/>
-          <w:color w:val="000000" w:themeColor="text1"/>
-          <w:sz w:val="24"/>
-          <w:szCs w:val="24"/>
-        </w:rPr>
-        <w:t>claim</w:t>
-      </w:r>
-      <w:r>
-        <w:rPr>
-          <w:rFonts w:ascii="Cambria" w:hAnsi="Cambria"/>
-          <w:color w:val="000000" w:themeColor="text1"/>
-          <w:sz w:val="24"/>
-          <w:szCs w:val="24"/>
-        </w:rPr>
-        <w:t>}</w:t>
-      </w:r>
-      <w:r>
-        <w:rPr>
-          <w:rFonts w:ascii="Cambria" w:hAnsi="Cambria"/>
-          <w:color w:val="000000" w:themeColor="text1"/>
-          <w:sz w:val="24"/>
-          <w:szCs w:val="24"/>
-        </w:rPr>
-        <w:t xml:space="preserve"> </w:t>
-      </w:r>
-    </w:p>
-    <w:p>
-      <w:pPr>
-        <w:spacing w:line="480" w:lineRule="auto"/>
-        <w:jc w:val="both"/>
-        <w:rPr>
-          <w:rFonts w:ascii="Cambria" w:hAnsi="Cambria"/>
-          <w:color w:val="FF0000"/>
-          <w:sz w:val="24"/>
-          <w:szCs w:val="24"/>
-        </w:rPr>
-      </w:pPr>
-    </w:p>
-    <w:p>
-      <w:pPr>
-        <w:pStyle w:val="TableParagraph"/>
-        <w:tabs>
-          <w:tab w:val="left" w:pos="6345"/>
-        </w:tabs>
-        <w:spacing w:before="230" w:line="247" w:lineRule="auto"/>
-        <w:ind w:left="5849" w:right="109" w:hanging="2789"/>
-        <w:jc w:val="both"/>
-        <w:rPr>
-          <w:sz w:val="24"/>
-        </w:rPr>
-      </w:pPr>
-      <w:r>
-        <w:rPr>
-          <w:noProof/>
-          <w:sz w:val="24"/>
-          <w:lang w:eastAsia="en-IN"/>
-        </w:rPr>
-        <w:t xml:space="preserve">                                                    </w:t>
-      </w:r>
-      <w:r>
-        <w:rPr>
-          <w:noProof/>
-          <w:sz w:val="24"/>
-          <w:lang w:eastAsia="en-IN"/>
-        </w:rPr>
-        <w:t>{%inventor_signature} </w:t>
-      </w:r>
-      <w:r>
-        <w:rPr>
-          <w:noProof/>
-          <w:sz w:val="24"/>
-          <w:lang w:eastAsia="en-IN"/>
-        </w:rPr>
-        <w:t xml:space="preserve"> </w:t>
-      </w:r>
-      <w:r>
-        <w:rPr>
-          <w:sz w:val="24"/>
-        </w:rPr>
-        <w:t xml:space="preserve">                                                                </w:t>
-      </w:r>
-    </w:p>
-    <w:p>
-      <w:pPr>
-        <w:pStyle w:val="TableParagraph"/>
-        <w:jc w:val="right"/>
-        <w:rPr>
-          <w:color w:val="FF0000"/>
-          <w:sz w:val="20"/>
-        </w:rPr>
-      </w:pPr>
-    </w:p>
-    <w:p>
-      <w:pPr>
-        <w:pStyle w:val="TableParagraph"/>
-        <w:tabs>
-          <w:tab w:val="left" w:pos="6345"/>
-        </w:tabs>
-        <w:spacing w:before="230" w:line="276" w:lineRule="auto"/>
-        <w:ind w:right="109"/>
-        <w:rPr>
-          <w:color w:val="000000" w:themeColor="text1"/>
-          <w:sz w:val="24"/>
-          <w:lang w:val="en-IN"/>
-        </w:rPr>
-      </w:pPr>
-      <w:r>
-        <w:rPr>
-          <w:sz w:val="24"/>
-        </w:rPr>
         <w:t xml:space="preserve">                                                                                                                 </w:t>
       </w:r>
       <w:r>
@@ -1120,28 +1144,6 @@
       <w:pPr>
         <w:spacing w:line="480" w:lineRule="auto"/>
         <w:jc w:val="right"/>
-        <w:rPr>
-          <w:rFonts w:ascii="Cambria" w:hAnsi="Cambria"/>
-          <w:sz w:val="24"/>
-          <w:szCs w:val="24"/>
-        </w:rPr>
-      </w:pPr>
-    </w:p>
-    <w:p>
-      <w:pPr>
-        <w:spacing w:line="480" w:lineRule="auto"/>
-        <w:jc w:val="both"/>
-        <w:rPr>
-          <w:rFonts w:ascii="Cambria" w:hAnsi="Cambria"/>
-          <w:sz w:val="24"/>
-          <w:szCs w:val="24"/>
-        </w:rPr>
-      </w:pPr>
-    </w:p>
-    <w:p>
-      <w:pPr>
-        <w:spacing w:line="480" w:lineRule="auto"/>
-        <w:jc w:val="both"/>
         <w:rPr>
           <w:rFonts w:ascii="Cambria" w:hAnsi="Cambria"/>
           <w:sz w:val="24"/>
@@ -1320,7 +1322,6 @@
       <w:footerReference w:type="default" r:id="rId7"/>
       <w:pgSz w:w="11906" w:h="16838"/>
       <w:pgMar w:top="2268" w:right="1701" w:bottom="1701" w:left="2268" w:header="709" w:footer="709" w:gutter="0"/>
-      <w:lnNumType w:countBy="5"/>
       <w:cols w:space="708"/>
       <w:docGrid w:linePitch="360"/>
     </w:sectPr>
@@ -2163,6 +2164,7 @@
   <w:style w:type="character" w:default="1" w:styleId="DefaultParagraphFont">
     <w:name w:val="Default Paragraph Font"/>
     <w:uiPriority w:val="1"/>
+    <w:semiHidden/>
     <w:unhideWhenUsed/>
   </w:style>
   <w:style w:type="table" w:default="1" w:styleId="TableNormal">

</xml_diff>